<commit_message>
[FP] Lab 1 report fix & Lab 2 report
</commit_message>
<xml_diff>
--- a/[FP]Lab1/astro_analyze_report.docx
+++ b/[FP]Lab1/astro_analyze_report.docx
@@ -632,9 +632,9 @@
               <w:i w:val="0"/>
               <w:iCs w:val="0"/>
               <w:noProof/>
-              <w:sz w:val="22"/>
-              <w:szCs w:val="22"/>
+              <w:kern w:val="2"/>
               <w:lang w:eastAsia="ru-RU"/>
+              <w14:ligatures w14:val="standardContextual"/>
             </w:rPr>
           </w:pPr>
           <w:r>
@@ -655,7 +655,7 @@
             </w:rPr>
             <w:fldChar w:fldCharType="separate"/>
           </w:r>
-          <w:hyperlink w:anchor="_Toc210260005" w:history="1">
+          <w:hyperlink w:anchor="_Toc213209875" w:history="1">
             <w:r>
               <w:rPr>
                 <w:rStyle w:val="a3"/>
@@ -693,7 +693,7 @@
                 <w:noProof/>
                 <w:webHidden/>
               </w:rPr>
-              <w:instrText xml:space="preserve"> PAGEREF _Toc210260005 \h </w:instrText>
+              <w:instrText xml:space="preserve"> PAGEREF _Toc213209875 \h </w:instrText>
             </w:r>
             <w:r>
               <w:rPr>
@@ -737,12 +737,12 @@
               <w:i w:val="0"/>
               <w:iCs w:val="0"/>
               <w:noProof/>
-              <w:sz w:val="22"/>
-              <w:szCs w:val="22"/>
+              <w:kern w:val="2"/>
               <w:lang w:eastAsia="ru-RU"/>
+              <w14:ligatures w14:val="standardContextual"/>
             </w:rPr>
           </w:pPr>
-          <w:hyperlink w:anchor="_Toc210260006" w:history="1">
+          <w:hyperlink w:anchor="_Toc213209876" w:history="1">
             <w:r>
               <w:rPr>
                 <w:rStyle w:val="a3"/>
@@ -780,7 +780,7 @@
                 <w:noProof/>
                 <w:webHidden/>
               </w:rPr>
-              <w:instrText xml:space="preserve"> PAGEREF _Toc210260006 \h </w:instrText>
+              <w:instrText xml:space="preserve"> PAGEREF _Toc213209876 \h </w:instrText>
             </w:r>
             <w:r>
               <w:rPr>
@@ -824,12 +824,12 @@
               <w:i w:val="0"/>
               <w:iCs w:val="0"/>
               <w:noProof/>
-              <w:sz w:val="22"/>
-              <w:szCs w:val="22"/>
+              <w:kern w:val="2"/>
               <w:lang w:eastAsia="ru-RU"/>
+              <w14:ligatures w14:val="standardContextual"/>
             </w:rPr>
           </w:pPr>
-          <w:hyperlink w:anchor="_Toc210260007" w:history="1">
+          <w:hyperlink w:anchor="_Toc213209877" w:history="1">
             <w:r>
               <w:rPr>
                 <w:rStyle w:val="a3"/>
@@ -867,7 +867,7 @@
                 <w:noProof/>
                 <w:webHidden/>
               </w:rPr>
-              <w:instrText xml:space="preserve"> PAGEREF _Toc210260007 \h </w:instrText>
+              <w:instrText xml:space="preserve"> PAGEREF _Toc213209877 \h </w:instrText>
             </w:r>
             <w:r>
               <w:rPr>
@@ -911,12 +911,12 @@
               <w:i w:val="0"/>
               <w:iCs w:val="0"/>
               <w:noProof/>
-              <w:sz w:val="22"/>
-              <w:szCs w:val="22"/>
+              <w:kern w:val="2"/>
               <w:lang w:eastAsia="ru-RU"/>
+              <w14:ligatures w14:val="standardContextual"/>
             </w:rPr>
           </w:pPr>
-          <w:hyperlink w:anchor="_Toc210260008" w:history="1">
+          <w:hyperlink w:anchor="_Toc213209878" w:history="1">
             <w:r>
               <w:rPr>
                 <w:rStyle w:val="a3"/>
@@ -954,7 +954,7 @@
                 <w:noProof/>
                 <w:webHidden/>
               </w:rPr>
-              <w:instrText xml:space="preserve"> PAGEREF _Toc210260008 \h </w:instrText>
+              <w:instrText xml:space="preserve"> PAGEREF _Toc213209878 \h </w:instrText>
             </w:r>
             <w:r>
               <w:rPr>
@@ -998,12 +998,12 @@
               <w:i w:val="0"/>
               <w:iCs w:val="0"/>
               <w:noProof/>
-              <w:sz w:val="22"/>
-              <w:szCs w:val="22"/>
+              <w:kern w:val="2"/>
               <w:lang w:eastAsia="ru-RU"/>
+              <w14:ligatures w14:val="standardContextual"/>
             </w:rPr>
           </w:pPr>
-          <w:hyperlink w:anchor="_Toc210260009" w:history="1">
+          <w:hyperlink w:anchor="_Toc213209879" w:history="1">
             <w:r>
               <w:rPr>
                 <w:rStyle w:val="a3"/>
@@ -1041,7 +1041,7 @@
                 <w:noProof/>
                 <w:webHidden/>
               </w:rPr>
-              <w:instrText xml:space="preserve"> PAGEREF _Toc210260009 \h </w:instrText>
+              <w:instrText xml:space="preserve"> PAGEREF _Toc213209879 \h </w:instrText>
             </w:r>
             <w:r>
               <w:rPr>
@@ -1085,12 +1085,12 @@
               <w:i w:val="0"/>
               <w:iCs w:val="0"/>
               <w:noProof/>
-              <w:sz w:val="22"/>
-              <w:szCs w:val="22"/>
+              <w:kern w:val="2"/>
               <w:lang w:eastAsia="ru-RU"/>
+              <w14:ligatures w14:val="standardContextual"/>
             </w:rPr>
           </w:pPr>
-          <w:hyperlink w:anchor="_Toc210260010" w:history="1">
+          <w:hyperlink w:anchor="_Toc213209880" w:history="1">
             <w:r>
               <w:rPr>
                 <w:rStyle w:val="a3"/>
@@ -1128,7 +1128,7 @@
                 <w:noProof/>
                 <w:webHidden/>
               </w:rPr>
-              <w:instrText xml:space="preserve"> PAGEREF _Toc210260010 \h </w:instrText>
+              <w:instrText xml:space="preserve"> PAGEREF _Toc213209880 \h </w:instrText>
             </w:r>
             <w:r>
               <w:rPr>
@@ -1172,12 +1172,12 @@
               <w:i w:val="0"/>
               <w:iCs w:val="0"/>
               <w:noProof/>
-              <w:sz w:val="22"/>
-              <w:szCs w:val="22"/>
+              <w:kern w:val="2"/>
               <w:lang w:eastAsia="ru-RU"/>
+              <w14:ligatures w14:val="standardContextual"/>
             </w:rPr>
           </w:pPr>
-          <w:hyperlink w:anchor="_Toc210260011" w:history="1">
+          <w:hyperlink w:anchor="_Toc213209881" w:history="1">
             <w:r>
               <w:rPr>
                 <w:rStyle w:val="a3"/>
@@ -1215,7 +1215,7 @@
                 <w:noProof/>
                 <w:webHidden/>
               </w:rPr>
-              <w:instrText xml:space="preserve"> PAGEREF _Toc210260011 \h </w:instrText>
+              <w:instrText xml:space="preserve"> PAGEREF _Toc213209881 \h </w:instrText>
             </w:r>
             <w:r>
               <w:rPr>
@@ -1259,12 +1259,12 @@
               <w:i w:val="0"/>
               <w:iCs w:val="0"/>
               <w:noProof/>
-              <w:sz w:val="22"/>
-              <w:szCs w:val="22"/>
+              <w:kern w:val="2"/>
               <w:lang w:eastAsia="ru-RU"/>
+              <w14:ligatures w14:val="standardContextual"/>
             </w:rPr>
           </w:pPr>
-          <w:hyperlink w:anchor="_Toc210260012" w:history="1">
+          <w:hyperlink w:anchor="_Toc213209882" w:history="1">
             <w:r>
               <w:rPr>
                 <w:rStyle w:val="a3"/>
@@ -1302,7 +1302,7 @@
                 <w:noProof/>
                 <w:webHidden/>
               </w:rPr>
-              <w:instrText xml:space="preserve"> PAGEREF _Toc210260012 \h </w:instrText>
+              <w:instrText xml:space="preserve"> PAGEREF _Toc213209882 \h </w:instrText>
             </w:r>
             <w:r>
               <w:rPr>
@@ -1346,12 +1346,12 @@
               <w:i w:val="0"/>
               <w:iCs w:val="0"/>
               <w:noProof/>
-              <w:sz w:val="22"/>
-              <w:szCs w:val="22"/>
+              <w:kern w:val="2"/>
               <w:lang w:eastAsia="ru-RU"/>
+              <w14:ligatures w14:val="standardContextual"/>
             </w:rPr>
           </w:pPr>
-          <w:hyperlink w:anchor="_Toc210260013" w:history="1">
+          <w:hyperlink w:anchor="_Toc213209883" w:history="1">
             <w:r>
               <w:rPr>
                 <w:rStyle w:val="a3"/>
@@ -1368,7 +1368,7 @@
                   <w14:round/>
                 </w14:textOutline>
               </w:rPr>
-              <w:t>Вывод</w:t>
+              <w:t>Исследование</w:t>
             </w:r>
             <w:r>
               <w:rPr>
@@ -1389,7 +1389,7 @@
                 <w:noProof/>
                 <w:webHidden/>
               </w:rPr>
-              <w:instrText xml:space="preserve"> PAGEREF _Toc210260013 \h </w:instrText>
+              <w:instrText xml:space="preserve"> PAGEREF _Toc213209883 \h </w:instrText>
             </w:r>
             <w:r>
               <w:rPr>
@@ -1433,12 +1433,12 @@
               <w:i w:val="0"/>
               <w:iCs w:val="0"/>
               <w:noProof/>
-              <w:sz w:val="22"/>
-              <w:szCs w:val="22"/>
+              <w:kern w:val="2"/>
               <w:lang w:eastAsia="ru-RU"/>
+              <w14:ligatures w14:val="standardContextual"/>
             </w:rPr>
           </w:pPr>
-          <w:hyperlink w:anchor="_Toc210260014" w:history="1">
+          <w:hyperlink w:anchor="_Toc213209884" w:history="1">
             <w:r>
               <w:rPr>
                 <w:rStyle w:val="a3"/>
@@ -1455,7 +1455,7 @@
                   <w14:round/>
                 </w14:textOutline>
               </w:rPr>
-              <w:t>Список использованной литературы</w:t>
+              <w:t>Вывод</w:t>
             </w:r>
             <w:r>
               <w:rPr>
@@ -1476,7 +1476,7 @@
                 <w:noProof/>
                 <w:webHidden/>
               </w:rPr>
-              <w:instrText xml:space="preserve"> PAGEREF _Toc210260014 \h </w:instrText>
+              <w:instrText xml:space="preserve"> PAGEREF _Toc213209884 \h </w:instrText>
             </w:r>
             <w:r>
               <w:rPr>
@@ -1497,6 +1497,93 @@
                 <w:webHidden/>
               </w:rPr>
               <w:t>16</w:t>
+            </w:r>
+            <w:r>
+              <w:rPr>
+                <w:noProof/>
+                <w:webHidden/>
+              </w:rPr>
+              <w:fldChar w:fldCharType="end"/>
+            </w:r>
+          </w:hyperlink>
+        </w:p>
+        <w:p>
+          <w:pPr>
+            <w:pStyle w:val="12"/>
+            <w:tabs>
+              <w:tab w:val="right" w:leader="dot" w:pos="9344"/>
+            </w:tabs>
+            <w:rPr>
+              <w:rFonts w:asciiTheme="minorHAnsi" w:eastAsiaTheme="minorEastAsia" w:hAnsiTheme="minorHAnsi" w:cstheme="minorBidi"/>
+              <w:b w:val="0"/>
+              <w:bCs w:val="0"/>
+              <w:i w:val="0"/>
+              <w:iCs w:val="0"/>
+              <w:noProof/>
+              <w:kern w:val="2"/>
+              <w:lang w:eastAsia="ru-RU"/>
+              <w14:ligatures w14:val="standardContextual"/>
+            </w:rPr>
+          </w:pPr>
+          <w:hyperlink w:anchor="_Toc213209885" w:history="1">
+            <w:r>
+              <w:rPr>
+                <w:rStyle w:val="a3"/>
+                <w:rFonts w:cs="Times New Roman"/>
+                <w:noProof/>
+                <w14:shadow w14:blurRad="38100" w14:dist="19050" w14:dir="2700000" w14:sx="100000" w14:sy="100000" w14:kx="0" w14:ky="0" w14:algn="tl">
+                  <w14:schemeClr w14:val="dk1">
+                    <w14:alpha w14:val="60000"/>
+                  </w14:schemeClr>
+                </w14:shadow>
+                <w14:textOutline w14:w="0" w14:cap="flat" w14:cmpd="sng" w14:algn="ctr">
+                  <w14:noFill/>
+                  <w14:prstDash w14:val="solid"/>
+                  <w14:round/>
+                </w14:textOutline>
+              </w:rPr>
+              <w:t>Список использованной литературы</w:t>
+            </w:r>
+            <w:r>
+              <w:rPr>
+                <w:noProof/>
+                <w:webHidden/>
+              </w:rPr>
+              <w:tab/>
+            </w:r>
+            <w:r>
+              <w:rPr>
+                <w:noProof/>
+                <w:webHidden/>
+              </w:rPr>
+              <w:fldChar w:fldCharType="begin"/>
+            </w:r>
+            <w:r>
+              <w:rPr>
+                <w:noProof/>
+                <w:webHidden/>
+              </w:rPr>
+              <w:instrText xml:space="preserve"> PAGEREF _Toc213209885 \h </w:instrText>
+            </w:r>
+            <w:r>
+              <w:rPr>
+                <w:noProof/>
+                <w:webHidden/>
+              </w:rPr>
+            </w:r>
+            <w:r>
+              <w:rPr>
+                <w:noProof/>
+                <w:webHidden/>
+              </w:rPr>
+              <w:fldChar w:fldCharType="separate"/>
+            </w:r>
+            <w:r>
+              <w:rPr>
+                <w:noProof/>
+                <w:webHidden/>
+              </w:rPr>
+              <w:t>17</w:t>
             </w:r>
             <w:r>
               <w:rPr>
@@ -1634,7 +1721,7 @@
           </w14:textOutline>
         </w:rPr>
       </w:pPr>
-      <w:bookmarkStart w:id="1" w:name="_Toc210260005"/>
+      <w:bookmarkStart w:id="1" w:name="_Toc213209875"/>
       <w:r>
         <w:rPr>
           <w:rStyle w:val="ab"/>
@@ -1660,21 +1747,13 @@
     </w:p>
     <w:p>
       <w:pPr>
-        <w:pStyle w:val="10"/>
-        <w:rPr>
-          <w:rFonts w:ascii="Times New Roman" w:eastAsiaTheme="minorHAnsi" w:hAnsi="Times New Roman" w:cs="Times New Roman"/>
-          <w:color w:val="auto"/>
-          <w:sz w:val="28"/>
-          <w:szCs w:val="28"/>
-        </w:rPr>
-      </w:pPr>
-      <w:bookmarkStart w:id="2" w:name="_Toc210260006"/>
-      <w:r>
-        <w:rPr>
-          <w:rFonts w:ascii="Times New Roman" w:eastAsiaTheme="minorHAnsi" w:hAnsi="Times New Roman" w:cs="Times New Roman"/>
-          <w:color w:val="auto"/>
-          <w:sz w:val="28"/>
-          <w:szCs w:val="28"/>
+        <w:rPr>
+          <w:rFonts w:eastAsiaTheme="minorHAnsi"/>
+        </w:rPr>
+      </w:pPr>
+      <w:r>
+        <w:rPr>
+          <w:rFonts w:eastAsiaTheme="minorHAnsi"/>
         </w:rPr>
         <w:t>Целью данной лабораторной работы является разработка программы для анализа космических изображений с использованием параллельных вычислений. Основная задача заключается в эффективной обработке астрономических снимков с космического телескопа, позволяющей автоматически находить и классифицировать астрономические объекты (звезды, галактики, туманности, кометы и др.), а также собирать статистические данные о них.</w:t>
       </w:r>
@@ -1701,6 +1780,7 @@
           </w14:textOutline>
         </w:rPr>
       </w:pPr>
+      <w:bookmarkStart w:id="2" w:name="_Toc213209876"/>
       <w:r>
         <w:rPr>
           <w:rStyle w:val="ab"/>
@@ -1901,7 +1981,11 @@
         <w:t xml:space="preserve"> </w:t>
       </w:r>
       <w:r>
-        <w:t>реализовать графический интерфейс для взаимодействия с программой, который будет включать предпросмотр выбранного изображения, выбор количества блоков, просмотр результата и выбор директории для сохранения таблицы результатов.</w:t>
+        <w:t xml:space="preserve">реализовать графический интерфейс для взаимодействия с программой, который будет включать предпросмотр выбранного изображения, выбор количества блоков, </w:t>
+      </w:r>
+      <w:r>
+        <w:lastRenderedPageBreak/>
+        <w:t>просмотр результата и выбор директории для сохранения таблицы результатов.</w:t>
       </w:r>
     </w:p>
     <w:p>
@@ -1928,7 +2012,6 @@
             <w14:round/>
           </w14:textOutline>
         </w:rPr>
-        <w:lastRenderedPageBreak/>
         <w:t>Теоретическая часть</w:t>
       </w:r>
     </w:p>
@@ -2167,6 +2250,7 @@
           <w:b/>
           <w:bCs/>
         </w:rPr>
+        <w:lastRenderedPageBreak/>
         <w:t>Галактики</w:t>
       </w:r>
       <w:r>
@@ -2224,7 +2308,6 @@
           <w:b/>
           <w:bCs/>
         </w:rPr>
-        <w:lastRenderedPageBreak/>
         <w:t>Кометы и астероиды</w:t>
       </w:r>
       <w:r>
@@ -2417,7 +2500,7 @@
           </w14:textOutline>
         </w:rPr>
       </w:pPr>
-      <w:bookmarkStart w:id="3" w:name="_Toc210260007"/>
+      <w:bookmarkStart w:id="3" w:name="_Toc213209877"/>
       <w:r>
         <w:rPr>
           <w:rStyle w:val="ab"/>
@@ -2536,6 +2619,7 @@
           <w:b/>
           <w:bCs/>
         </w:rPr>
+        <w:lastRenderedPageBreak/>
         <w:t>Разделение изображения на блоки</w:t>
       </w:r>
       <w:r>
@@ -2559,7 +2643,6 @@
           <w:b/>
           <w:bCs/>
         </w:rPr>
-        <w:lastRenderedPageBreak/>
         <w:t>П</w:t>
       </w:r>
       <w:r>
@@ -2625,7 +2708,7 @@
           </w14:textOutline>
         </w:rPr>
       </w:pPr>
-      <w:bookmarkStart w:id="4" w:name="_Toc210260008"/>
+      <w:bookmarkStart w:id="4" w:name="_Toc213209878"/>
       <w:r>
         <w:rPr>
           <w:rStyle w:val="ab"/>
@@ -2847,7 +2930,7 @@
           </w14:textOutline>
         </w:rPr>
       </w:pPr>
-      <w:bookmarkStart w:id="5" w:name="_Toc210260009"/>
+      <w:bookmarkStart w:id="5" w:name="_Toc213209879"/>
       <w:r>
         <w:rPr>
           <w:rStyle w:val="ab"/>
@@ -4987,7 +5070,7 @@
           </w14:textOutline>
         </w:rPr>
       </w:pPr>
-      <w:bookmarkStart w:id="6" w:name="_Toc210260010"/>
+      <w:bookmarkStart w:id="6" w:name="_Toc213209880"/>
       <w:r>
         <w:rPr>
           <w:rStyle w:val="ab"/>
@@ -5600,7 +5683,7 @@
           </w14:textOutline>
         </w:rPr>
       </w:pPr>
-      <w:bookmarkStart w:id="7" w:name="_Toc210260011"/>
+      <w:bookmarkStart w:id="7" w:name="_Toc213209881"/>
       <w:r>
         <w:rPr>
           <w:rStyle w:val="ab"/>
@@ -5949,7 +6032,7 @@
           </w14:textOutline>
         </w:rPr>
       </w:pPr>
-      <w:bookmarkStart w:id="8" w:name="_Toc210260012"/>
+      <w:bookmarkStart w:id="8" w:name="_Toc213209882"/>
       <w:r>
         <w:rPr>
           <w:rStyle w:val="ab"/>
@@ -6207,10 +6290,510 @@
         <w:t>Для анализа больших каталогов изображений можно создать цикл автоматической обработки с сохранением результатов в отдельные подпапки.</w:t>
       </w:r>
     </w:p>
-    <w:p>
-      <w:pPr>
-        <w:ind w:left="708"/>
-      </w:pPr>
+    <w:p/>
+    <w:p>
+      <w:pPr>
+        <w:pStyle w:val="10"/>
+        <w:rPr>
+          <w:rStyle w:val="ab"/>
+          <w:rFonts w:ascii="Times New Roman" w:hAnsi="Times New Roman" w:cs="Times New Roman"/>
+          <w:color w:val="000000" w:themeColor="text1"/>
+          <w:sz w:val="28"/>
+          <w:szCs w:val="28"/>
+          <w14:shadow w14:blurRad="38100" w14:dist="19050" w14:dir="2700000" w14:sx="100000" w14:sy="100000" w14:kx="0" w14:ky="0" w14:algn="tl">
+            <w14:schemeClr w14:val="dk1">
+              <w14:alpha w14:val="60000"/>
+            </w14:schemeClr>
+          </w14:shadow>
+          <w14:textOutline w14:w="0" w14:cap="flat" w14:cmpd="sng" w14:algn="ctr">
+            <w14:noFill/>
+            <w14:prstDash w14:val="solid"/>
+            <w14:round/>
+          </w14:textOutline>
+        </w:rPr>
+      </w:pPr>
+      <w:bookmarkStart w:id="9" w:name="_Toc213209883"/>
+      <w:r>
+        <w:rPr>
+          <w:rStyle w:val="ab"/>
+          <w:rFonts w:ascii="Times New Roman" w:hAnsi="Times New Roman" w:cs="Times New Roman"/>
+          <w:color w:val="000000" w:themeColor="text1"/>
+          <w:sz w:val="28"/>
+          <w:szCs w:val="28"/>
+          <w14:shadow w14:blurRad="38100" w14:dist="19050" w14:dir="2700000" w14:sx="100000" w14:sy="100000" w14:kx="0" w14:ky="0" w14:algn="tl">
+            <w14:schemeClr w14:val="dk1">
+              <w14:alpha w14:val="60000"/>
+            </w14:schemeClr>
+          </w14:shadow>
+          <w14:textOutline w14:w="0" w14:cap="flat" w14:cmpd="sng" w14:algn="ctr">
+            <w14:noFill/>
+            <w14:prstDash w14:val="solid"/>
+            <w14:round/>
+          </w14:textOutline>
+        </w:rPr>
+        <w:t>Исследование</w:t>
+      </w:r>
+      <w:bookmarkEnd w:id="9"/>
+    </w:p>
+    <w:p>
+      <w:pPr>
+        <w:rPr>
+          <w:b/>
+          <w:bCs/>
+        </w:rPr>
+      </w:pPr>
+      <w:r>
+        <w:rPr>
+          <w:b/>
+          <w:bCs/>
+        </w:rPr>
+        <w:t>Влияние числа кропов на скорость</w:t>
+      </w:r>
+    </w:p>
+    <w:p>
+      <w:r>
+        <w:t>Оцен</w:t>
+      </w:r>
+      <w:r>
+        <w:t>ено</w:t>
+      </w:r>
+      <w:r>
+        <w:t>, как разбиение кадра на блоки (многопоточность) влияет на время обработки одного и того же снимка:</w:t>
+      </w:r>
+    </w:p>
+    <w:tbl>
+      <w:tblPr>
+        <w:tblStyle w:val="af1"/>
+        <w:tblW w:w="0" w:type="auto"/>
+        <w:tblLook w:val="04A0" w:firstRow="1" w:lastRow="0" w:firstColumn="1" w:lastColumn="0" w:noHBand="0" w:noVBand="1"/>
+      </w:tblPr>
+      <w:tblGrid>
+        <w:gridCol w:w="4672"/>
+        <w:gridCol w:w="4672"/>
+      </w:tblGrid>
+      <w:tr>
+        <w:tc>
+          <w:tcPr>
+            <w:tcW w:w="4672" w:type="dxa"/>
+          </w:tcPr>
+          <w:p>
+            <w:pPr>
+              <w:jc w:val="center"/>
+            </w:pPr>
+            <w:r>
+              <w:t>Разбиение</w:t>
+            </w:r>
+          </w:p>
+        </w:tc>
+        <w:tc>
+          <w:tcPr>
+            <w:tcW w:w="4672" w:type="dxa"/>
+          </w:tcPr>
+          <w:p>
+            <w:pPr>
+              <w:jc w:val="center"/>
+            </w:pPr>
+            <w:r>
+              <w:t>Время обработки, с</w:t>
+            </w:r>
+          </w:p>
+        </w:tc>
+      </w:tr>
+      <w:tr>
+        <w:tc>
+          <w:tcPr>
+            <w:tcW w:w="4672" w:type="dxa"/>
+          </w:tcPr>
+          <w:p>
+            <w:pPr>
+              <w:jc w:val="center"/>
+            </w:pPr>
+            <w:r>
+              <w:t>1</w:t>
+            </w:r>
+            <w:r>
+              <w:t>×</w:t>
+            </w:r>
+            <w:r>
+              <w:t>1</w:t>
+            </w:r>
+          </w:p>
+        </w:tc>
+        <w:tc>
+          <w:tcPr>
+            <w:tcW w:w="4672" w:type="dxa"/>
+          </w:tcPr>
+          <w:p>
+            <w:pPr>
+              <w:jc w:val="center"/>
+            </w:pPr>
+            <w:r>
+              <w:t>29</w:t>
+            </w:r>
+          </w:p>
+        </w:tc>
+      </w:tr>
+      <w:tr>
+        <w:tc>
+          <w:tcPr>
+            <w:tcW w:w="4672" w:type="dxa"/>
+          </w:tcPr>
+          <w:p>
+            <w:pPr>
+              <w:jc w:val="center"/>
+            </w:pPr>
+            <w:r>
+              <w:t>1</w:t>
+            </w:r>
+            <w:r>
+              <w:t>×</w:t>
+            </w:r>
+            <w:r>
+              <w:t>2</w:t>
+            </w:r>
+          </w:p>
+        </w:tc>
+        <w:tc>
+          <w:tcPr>
+            <w:tcW w:w="4672" w:type="dxa"/>
+          </w:tcPr>
+          <w:p>
+            <w:pPr>
+              <w:jc w:val="center"/>
+            </w:pPr>
+            <w:r>
+              <w:t>9,53</w:t>
+            </w:r>
+          </w:p>
+        </w:tc>
+      </w:tr>
+      <w:tr>
+        <w:tc>
+          <w:tcPr>
+            <w:tcW w:w="4672" w:type="dxa"/>
+          </w:tcPr>
+          <w:p>
+            <w:pPr>
+              <w:jc w:val="center"/>
+            </w:pPr>
+            <w:r>
+              <w:t>2</w:t>
+            </w:r>
+            <w:r>
+              <w:t>×</w:t>
+            </w:r>
+            <w:r>
+              <w:t>2</w:t>
+            </w:r>
+          </w:p>
+        </w:tc>
+        <w:tc>
+          <w:tcPr>
+            <w:tcW w:w="4672" w:type="dxa"/>
+          </w:tcPr>
+          <w:p>
+            <w:pPr>
+              <w:jc w:val="center"/>
+            </w:pPr>
+            <w:r>
+              <w:t>4,67</w:t>
+            </w:r>
+          </w:p>
+        </w:tc>
+      </w:tr>
+      <w:tr>
+        <w:tc>
+          <w:tcPr>
+            <w:tcW w:w="4672" w:type="dxa"/>
+          </w:tcPr>
+          <w:p>
+            <w:pPr>
+              <w:jc w:val="center"/>
+            </w:pPr>
+            <w:r>
+              <w:t>4</w:t>
+            </w:r>
+            <w:r>
+              <w:t>×</w:t>
+            </w:r>
+            <w:r>
+              <w:t>4</w:t>
+            </w:r>
+          </w:p>
+        </w:tc>
+        <w:tc>
+          <w:tcPr>
+            <w:tcW w:w="4672" w:type="dxa"/>
+          </w:tcPr>
+          <w:p>
+            <w:pPr>
+              <w:jc w:val="center"/>
+            </w:pPr>
+            <w:r>
+              <w:t>2,83</w:t>
+            </w:r>
+          </w:p>
+        </w:tc>
+      </w:tr>
+    </w:tbl>
+    <w:p>
+      <w:pPr>
+        <w:jc w:val="right"/>
+        <w:rPr>
+          <w:sz w:val="24"/>
+          <w:szCs w:val="24"/>
+        </w:rPr>
+      </w:pPr>
+      <w:r>
+        <w:rPr>
+          <w:sz w:val="24"/>
+          <w:szCs w:val="24"/>
+        </w:rPr>
+        <w:t xml:space="preserve">Для </w:t>
+      </w:r>
+      <w:r>
+        <w:rPr>
+          <w:sz w:val="24"/>
+          <w:szCs w:val="24"/>
+        </w:rPr>
+        <w:t>измерения</w:t>
+      </w:r>
+      <w:r>
+        <w:rPr>
+          <w:sz w:val="24"/>
+          <w:szCs w:val="24"/>
+        </w:rPr>
+        <w:t xml:space="preserve"> взят снимок heic0715a.tif - 3885×3904, 38.6мб</w:t>
+      </w:r>
+    </w:p>
+    <w:p>
+      <w:r>
+        <w:rPr>
+          <w:b/>
+          <w:bCs/>
+        </w:rPr>
+        <w:t>Выводы.</w:t>
+      </w:r>
+      <w:r>
+        <w:t xml:space="preserve"> При переходе к 1×2 и 2×2 виден </w:t>
+      </w:r>
+      <w:r>
+        <w:rPr>
+          <w:i/>
+          <w:iCs/>
+        </w:rPr>
+        <w:t>значительный</w:t>
+      </w:r>
+      <w:r>
+        <w:t xml:space="preserve"> прирост: меньше данных в блоке, лучше кэш и быстрее морфология/контуры. 4×4 даёт </w:t>
+      </w:r>
+      <w:r>
+        <w:lastRenderedPageBreak/>
+        <w:t xml:space="preserve">минимальное время, но растут накладные расходы (нарезка, синхронизация, сбор результатов). </w:t>
+      </w:r>
+    </w:p>
+    <w:p>
+      <w:pPr>
+        <w:rPr>
+          <w:b/>
+          <w:bCs/>
+        </w:rPr>
+      </w:pPr>
+      <w:r>
+        <w:rPr>
+          <w:b/>
+          <w:bCs/>
+        </w:rPr>
+        <w:t>Подбор характеристик классов</w:t>
+      </w:r>
+    </w:p>
+    <w:p>
+      <w:r>
+        <w:t xml:space="preserve">Пороговые значения заданы в нормализованной шкале яркости </w:t>
+      </w:r>
+      <w:r>
+        <w:rPr>
+          <w:b/>
+          <w:bCs/>
+        </w:rPr>
+        <w:t>[0;1]</w:t>
+      </w:r>
+      <w:r>
+        <w:t xml:space="preserve"> и подобраны экспериментально:</w:t>
+      </w:r>
+    </w:p>
+    <w:p>
+      <w:pPr>
+        <w:numPr>
+          <w:ilvl w:val="0"/>
+          <w:numId w:val="42"/>
+        </w:numPr>
+      </w:pPr>
+      <w:r>
+        <w:t>настро</w:t>
+      </w:r>
+      <w:r>
+        <w:t>ены</w:t>
+      </w:r>
+      <w:r>
+        <w:t xml:space="preserve"> интервалы по </w:t>
+      </w:r>
+      <w:r>
+        <w:rPr>
+          <w:b/>
+          <w:bCs/>
+        </w:rPr>
+        <w:t>средней/максимальной яркости</w:t>
+      </w:r>
+      <w:r>
+        <w:t xml:space="preserve"> и </w:t>
+      </w:r>
+      <w:r>
+        <w:rPr>
+          <w:b/>
+          <w:bCs/>
+        </w:rPr>
+        <w:t>площади контура</w:t>
+      </w:r>
+      <w:r>
+        <w:t>, отсекли шум минимальной площадью;</w:t>
+      </w:r>
+    </w:p>
+    <w:p>
+      <w:pPr>
+        <w:numPr>
+          <w:ilvl w:val="0"/>
+          <w:numId w:val="42"/>
+        </w:numPr>
+      </w:pPr>
+      <w:r>
+        <w:t>свели правила в компактный набор условий для присвоения класса/цвета.</w:t>
+      </w:r>
+    </w:p>
+    <w:p>
+      <w:pPr>
+        <w:rPr>
+          <w:b/>
+          <w:bCs/>
+        </w:rPr>
+      </w:pPr>
+      <w:r>
+        <w:rPr>
+          <w:b/>
+          <w:bCs/>
+        </w:rPr>
+        <w:t>Логика определения «комет»</w:t>
+      </w:r>
+    </w:p>
+    <w:p>
+      <w:r>
+        <w:t>Комета —</w:t>
+      </w:r>
+      <w:r>
+        <w:t xml:space="preserve"> </w:t>
+      </w:r>
+      <w:r>
+        <w:t xml:space="preserve">заметно </w:t>
+      </w:r>
+      <w:r>
+        <w:rPr>
+          <w:b/>
+          <w:bCs/>
+        </w:rPr>
+        <w:t>вытянутый</w:t>
+      </w:r>
+      <w:r>
+        <w:t xml:space="preserve"> объект </w:t>
+      </w:r>
+      <w:r>
+        <w:rPr>
+          <w:b/>
+          <w:bCs/>
+        </w:rPr>
+        <w:t>малой/средней площади</w:t>
+      </w:r>
+      <w:r>
+        <w:t xml:space="preserve"> с умеренной средней яркостью и локальным максимумом в центре. Признаки:</w:t>
+      </w:r>
+    </w:p>
+    <w:p>
+      <w:pPr>
+        <w:numPr>
+          <w:ilvl w:val="0"/>
+          <w:numId w:val="43"/>
+        </w:numPr>
+      </w:pPr>
+      <w:proofErr w:type="spellStart"/>
+      <w:r>
+        <w:t>area</w:t>
+      </w:r>
+      <w:proofErr w:type="spellEnd"/>
+      <w:r>
+        <w:t xml:space="preserve"> в заданном диапазоне (между шумом и туманностями);</w:t>
+      </w:r>
+    </w:p>
+    <w:p>
+      <w:pPr>
+        <w:numPr>
+          <w:ilvl w:val="0"/>
+          <w:numId w:val="43"/>
+        </w:numPr>
+      </w:pPr>
+      <w:proofErr w:type="spellStart"/>
+      <w:r>
+        <w:t>mean_brightness</w:t>
+      </w:r>
+      <w:proofErr w:type="spellEnd"/>
+      <w:r>
+        <w:t xml:space="preserve"> ниже ярких звёзд, а отношение </w:t>
+      </w:r>
+      <w:proofErr w:type="spellStart"/>
+      <w:r>
+        <w:t>max</w:t>
+      </w:r>
+      <w:proofErr w:type="spellEnd"/>
+      <w:r>
+        <w:t>/</w:t>
+      </w:r>
+      <w:proofErr w:type="spellStart"/>
+      <w:r>
+        <w:t>mean</w:t>
+      </w:r>
+      <w:proofErr w:type="spellEnd"/>
+      <w:r>
+        <w:t xml:space="preserve"> — умеренное (есть «ядро»);</w:t>
+      </w:r>
+    </w:p>
+    <w:p>
+      <w:pPr>
+        <w:numPr>
+          <w:ilvl w:val="0"/>
+          <w:numId w:val="43"/>
+        </w:numPr>
+      </w:pPr>
+      <w:r>
+        <w:t>низкая округлость / высокий эксцентриситет (контур вытянут).</w:t>
+      </w:r>
+    </w:p>
+    <w:p>
+      <w:pPr>
+        <w:rPr>
+          <w:b/>
+          <w:bCs/>
+        </w:rPr>
+      </w:pPr>
+      <w:r>
+        <w:rPr>
+          <w:b/>
+          <w:bCs/>
+        </w:rPr>
+        <w:t>Итог</w:t>
+      </w:r>
+    </w:p>
+    <w:p>
+      <w:r>
+        <w:t>Разбиение кадра существенно ускоряет работу; Пороговые правила по яркости и площади, подобранные на примерах, устойчиво разделяют классы; описанные формальные признаки надёжно выделяют кометы среди звёзд и туманностей.</w:t>
+      </w:r>
     </w:p>
     <w:p>
       <w:pPr>
@@ -6234,10 +6817,8 @@
           </w14:textOutline>
         </w:rPr>
       </w:pPr>
-    </w:p>
-    <w:p>
-      <w:pPr>
-        <w:pStyle w:val="10"/>
+      <w:bookmarkStart w:id="10" w:name="_Toc213209884"/>
+      <w:r>
         <w:rPr>
           <w:rStyle w:val="ab"/>
           <w:rFonts w:ascii="Times New Roman" w:hAnsi="Times New Roman" w:cs="Times New Roman"/>
@@ -6256,30 +6837,9 @@
             <w14:round/>
           </w14:textOutline>
         </w:rPr>
-      </w:pPr>
-      <w:bookmarkStart w:id="9" w:name="_Toc210260013"/>
-      <w:r>
-        <w:rPr>
-          <w:rStyle w:val="ab"/>
-          <w:rFonts w:ascii="Times New Roman" w:hAnsi="Times New Roman" w:cs="Times New Roman"/>
-          <w:b w:val="0"/>
-          <w:color w:val="000000" w:themeColor="text1"/>
-          <w:sz w:val="28"/>
-          <w:szCs w:val="28"/>
-          <w14:shadow w14:blurRad="38100" w14:dist="19050" w14:dir="2700000" w14:sx="100000" w14:sy="100000" w14:kx="0" w14:ky="0" w14:algn="tl">
-            <w14:schemeClr w14:val="dk1">
-              <w14:alpha w14:val="60000"/>
-            </w14:schemeClr>
-          </w14:shadow>
-          <w14:textOutline w14:w="0" w14:cap="flat" w14:cmpd="sng" w14:algn="ctr">
-            <w14:noFill/>
-            <w14:prstDash w14:val="solid"/>
-            <w14:round/>
-          </w14:textOutline>
-        </w:rPr>
         <w:t>Вывод</w:t>
       </w:r>
-      <w:bookmarkEnd w:id="9"/>
+      <w:bookmarkEnd w:id="10"/>
     </w:p>
     <w:p>
       <w:r>
@@ -6363,11 +6923,10 @@
       </w:r>
       <w:r>
         <w:br/>
-        <w:t xml:space="preserve">Использование многопоточности позволило существенно повысить </w:t>
       </w:r>
       <w:r>
         <w:lastRenderedPageBreak/>
-        <w:t>производительность и обеспечить эффективную обработку больших изображений.</w:t>
+        <w:t>Использование многопоточности позволило существенно повысить производительность и обеспечить эффективную обработку больших изображений.</w:t>
       </w:r>
     </w:p>
     <w:p>
@@ -6406,8 +6965,8 @@
       <w:r>
         <w:br/>
       </w:r>
-      <w:bookmarkStart w:id="10" w:name="_Toc178589199"/>
-      <w:bookmarkStart w:id="11" w:name="_Toc210260014"/>
+      <w:bookmarkStart w:id="11" w:name="_Toc178589199"/>
+      <w:bookmarkStart w:id="12" w:name="_Toc213209885"/>
       <w:r>
         <w:rPr>
           <w:rFonts w:ascii="Times New Roman" w:hAnsi="Times New Roman" w:cs="Times New Roman"/>
@@ -6428,8 +6987,8 @@
         </w:rPr>
         <w:t>Список использованной литературы</w:t>
       </w:r>
-      <w:bookmarkEnd w:id="10"/>
       <w:bookmarkEnd w:id="11"/>
+      <w:bookmarkEnd w:id="12"/>
     </w:p>
     <w:p>
       <w:pPr>
@@ -6788,6 +7347,155 @@
     </w:lvl>
   </w:abstractNum>
   <w:abstractNum w:abstractNumId="2" w15:restartNumberingAfterBreak="0">
+    <w:nsid w:val="0E27271E"/>
+    <w:multiLevelType w:val="multilevel"/>
+    <w:tmpl w:val="BB4A7442"/>
+    <w:lvl w:ilvl="0">
+      <w:start w:val="1"/>
+      <w:numFmt w:val="bullet"/>
+      <w:lvlText w:val=""/>
+      <w:lvlJc w:val="left"/>
+      <w:pPr>
+        <w:tabs>
+          <w:tab w:val="num" w:pos="720"/>
+        </w:tabs>
+        <w:ind w:left="720" w:hanging="360"/>
+      </w:pPr>
+      <w:rPr>
+        <w:rFonts w:ascii="Symbol" w:hAnsi="Symbol" w:hint="default"/>
+        <w:sz w:val="20"/>
+      </w:rPr>
+    </w:lvl>
+    <w:lvl w:ilvl="1" w:tentative="1">
+      <w:start w:val="1"/>
+      <w:numFmt w:val="bullet"/>
+      <w:lvlText w:val="o"/>
+      <w:lvlJc w:val="left"/>
+      <w:pPr>
+        <w:tabs>
+          <w:tab w:val="num" w:pos="1440"/>
+        </w:tabs>
+        <w:ind w:left="1440" w:hanging="360"/>
+      </w:pPr>
+      <w:rPr>
+        <w:rFonts w:ascii="Courier New" w:hAnsi="Courier New" w:hint="default"/>
+        <w:sz w:val="20"/>
+      </w:rPr>
+    </w:lvl>
+    <w:lvl w:ilvl="2" w:tentative="1">
+      <w:start w:val="1"/>
+      <w:numFmt w:val="bullet"/>
+      <w:lvlText w:val=""/>
+      <w:lvlJc w:val="left"/>
+      <w:pPr>
+        <w:tabs>
+          <w:tab w:val="num" w:pos="2160"/>
+        </w:tabs>
+        <w:ind w:left="2160" w:hanging="360"/>
+      </w:pPr>
+      <w:rPr>
+        <w:rFonts w:ascii="Wingdings" w:hAnsi="Wingdings" w:hint="default"/>
+        <w:sz w:val="20"/>
+      </w:rPr>
+    </w:lvl>
+    <w:lvl w:ilvl="3" w:tentative="1">
+      <w:start w:val="1"/>
+      <w:numFmt w:val="bullet"/>
+      <w:lvlText w:val=""/>
+      <w:lvlJc w:val="left"/>
+      <w:pPr>
+        <w:tabs>
+          <w:tab w:val="num" w:pos="2880"/>
+        </w:tabs>
+        <w:ind w:left="2880" w:hanging="360"/>
+      </w:pPr>
+      <w:rPr>
+        <w:rFonts w:ascii="Wingdings" w:hAnsi="Wingdings" w:hint="default"/>
+        <w:sz w:val="20"/>
+      </w:rPr>
+    </w:lvl>
+    <w:lvl w:ilvl="4" w:tentative="1">
+      <w:start w:val="1"/>
+      <w:numFmt w:val="bullet"/>
+      <w:lvlText w:val=""/>
+      <w:lvlJc w:val="left"/>
+      <w:pPr>
+        <w:tabs>
+          <w:tab w:val="num" w:pos="3600"/>
+        </w:tabs>
+        <w:ind w:left="3600" w:hanging="360"/>
+      </w:pPr>
+      <w:rPr>
+        <w:rFonts w:ascii="Wingdings" w:hAnsi="Wingdings" w:hint="default"/>
+        <w:sz w:val="20"/>
+      </w:rPr>
+    </w:lvl>
+    <w:lvl w:ilvl="5" w:tentative="1">
+      <w:start w:val="1"/>
+      <w:numFmt w:val="bullet"/>
+      <w:lvlText w:val=""/>
+      <w:lvlJc w:val="left"/>
+      <w:pPr>
+        <w:tabs>
+          <w:tab w:val="num" w:pos="4320"/>
+        </w:tabs>
+        <w:ind w:left="4320" w:hanging="360"/>
+      </w:pPr>
+      <w:rPr>
+        <w:rFonts w:ascii="Wingdings" w:hAnsi="Wingdings" w:hint="default"/>
+        <w:sz w:val="20"/>
+      </w:rPr>
+    </w:lvl>
+    <w:lvl w:ilvl="6" w:tentative="1">
+      <w:start w:val="1"/>
+      <w:numFmt w:val="bullet"/>
+      <w:lvlText w:val=""/>
+      <w:lvlJc w:val="left"/>
+      <w:pPr>
+        <w:tabs>
+          <w:tab w:val="num" w:pos="5040"/>
+        </w:tabs>
+        <w:ind w:left="5040" w:hanging="360"/>
+      </w:pPr>
+      <w:rPr>
+        <w:rFonts w:ascii="Wingdings" w:hAnsi="Wingdings" w:hint="default"/>
+        <w:sz w:val="20"/>
+      </w:rPr>
+    </w:lvl>
+    <w:lvl w:ilvl="7" w:tentative="1">
+      <w:start w:val="1"/>
+      <w:numFmt w:val="bullet"/>
+      <w:lvlText w:val=""/>
+      <w:lvlJc w:val="left"/>
+      <w:pPr>
+        <w:tabs>
+          <w:tab w:val="num" w:pos="5760"/>
+        </w:tabs>
+        <w:ind w:left="5760" w:hanging="360"/>
+      </w:pPr>
+      <w:rPr>
+        <w:rFonts w:ascii="Wingdings" w:hAnsi="Wingdings" w:hint="default"/>
+        <w:sz w:val="20"/>
+      </w:rPr>
+    </w:lvl>
+    <w:lvl w:ilvl="8" w:tentative="1">
+      <w:start w:val="1"/>
+      <w:numFmt w:val="bullet"/>
+      <w:lvlText w:val=""/>
+      <w:lvlJc w:val="left"/>
+      <w:pPr>
+        <w:tabs>
+          <w:tab w:val="num" w:pos="6480"/>
+        </w:tabs>
+        <w:ind w:left="6480" w:hanging="360"/>
+      </w:pPr>
+      <w:rPr>
+        <w:rFonts w:ascii="Wingdings" w:hAnsi="Wingdings" w:hint="default"/>
+        <w:sz w:val="20"/>
+      </w:rPr>
+    </w:lvl>
+  </w:abstractNum>
+  <w:abstractNum w:abstractNumId="3" w15:restartNumberingAfterBreak="0">
     <w:nsid w:val="1303F906"/>
     <w:multiLevelType w:val="multilevel"/>
     <w:tmpl w:val="80BC483E"/>
@@ -6873,7 +7581,7 @@
       </w:pPr>
     </w:lvl>
   </w:abstractNum>
-  <w:abstractNum w:abstractNumId="3" w15:restartNumberingAfterBreak="0">
+  <w:abstractNum w:abstractNumId="4" w15:restartNumberingAfterBreak="0">
     <w:nsid w:val="146A65F9"/>
     <w:multiLevelType w:val="multilevel"/>
     <w:tmpl w:val="915CF158"/>
@@ -6986,7 +7694,7 @@
       </w:pPr>
     </w:lvl>
   </w:abstractNum>
-  <w:abstractNum w:abstractNumId="4" w15:restartNumberingAfterBreak="0">
+  <w:abstractNum w:abstractNumId="5" w15:restartNumberingAfterBreak="0">
     <w:nsid w:val="156A5263"/>
     <w:multiLevelType w:val="multilevel"/>
     <w:tmpl w:val="E15AC648"/>
@@ -7072,7 +7780,7 @@
       </w:pPr>
     </w:lvl>
   </w:abstractNum>
-  <w:abstractNum w:abstractNumId="5" w15:restartNumberingAfterBreak="0">
+  <w:abstractNum w:abstractNumId="6" w15:restartNumberingAfterBreak="0">
     <w:nsid w:val="1664355A"/>
     <w:multiLevelType w:val="hybridMultilevel"/>
     <w:tmpl w:val="1E10B3B0"/>
@@ -7158,7 +7866,7 @@
       </w:pPr>
     </w:lvl>
   </w:abstractNum>
-  <w:abstractNum w:abstractNumId="6" w15:restartNumberingAfterBreak="0">
+  <w:abstractNum w:abstractNumId="7" w15:restartNumberingAfterBreak="0">
     <w:nsid w:val="183320EE"/>
     <w:multiLevelType w:val="multilevel"/>
     <w:tmpl w:val="F41EC676"/>
@@ -7307,7 +8015,7 @@
       </w:rPr>
     </w:lvl>
   </w:abstractNum>
-  <w:abstractNum w:abstractNumId="7" w15:restartNumberingAfterBreak="0">
+  <w:abstractNum w:abstractNumId="8" w15:restartNumberingAfterBreak="0">
     <w:nsid w:val="192F4CB1"/>
     <w:multiLevelType w:val="hybridMultilevel"/>
     <w:tmpl w:val="EFEA9106"/>
@@ -7420,7 +8128,156 @@
       </w:rPr>
     </w:lvl>
   </w:abstractNum>
-  <w:abstractNum w:abstractNumId="8" w15:restartNumberingAfterBreak="0">
+  <w:abstractNum w:abstractNumId="9" w15:restartNumberingAfterBreak="0">
+    <w:nsid w:val="200066AD"/>
+    <w:multiLevelType w:val="multilevel"/>
+    <w:tmpl w:val="A4B2D4EC"/>
+    <w:lvl w:ilvl="0">
+      <w:start w:val="1"/>
+      <w:numFmt w:val="bullet"/>
+      <w:lvlText w:val=""/>
+      <w:lvlJc w:val="left"/>
+      <w:pPr>
+        <w:tabs>
+          <w:tab w:val="num" w:pos="720"/>
+        </w:tabs>
+        <w:ind w:left="720" w:hanging="360"/>
+      </w:pPr>
+      <w:rPr>
+        <w:rFonts w:ascii="Symbol" w:hAnsi="Symbol" w:hint="default"/>
+        <w:sz w:val="20"/>
+      </w:rPr>
+    </w:lvl>
+    <w:lvl w:ilvl="1" w:tentative="1">
+      <w:start w:val="1"/>
+      <w:numFmt w:val="bullet"/>
+      <w:lvlText w:val="o"/>
+      <w:lvlJc w:val="left"/>
+      <w:pPr>
+        <w:tabs>
+          <w:tab w:val="num" w:pos="1440"/>
+        </w:tabs>
+        <w:ind w:left="1440" w:hanging="360"/>
+      </w:pPr>
+      <w:rPr>
+        <w:rFonts w:ascii="Courier New" w:hAnsi="Courier New" w:hint="default"/>
+        <w:sz w:val="20"/>
+      </w:rPr>
+    </w:lvl>
+    <w:lvl w:ilvl="2" w:tentative="1">
+      <w:start w:val="1"/>
+      <w:numFmt w:val="bullet"/>
+      <w:lvlText w:val=""/>
+      <w:lvlJc w:val="left"/>
+      <w:pPr>
+        <w:tabs>
+          <w:tab w:val="num" w:pos="2160"/>
+        </w:tabs>
+        <w:ind w:left="2160" w:hanging="360"/>
+      </w:pPr>
+      <w:rPr>
+        <w:rFonts w:ascii="Wingdings" w:hAnsi="Wingdings" w:hint="default"/>
+        <w:sz w:val="20"/>
+      </w:rPr>
+    </w:lvl>
+    <w:lvl w:ilvl="3" w:tentative="1">
+      <w:start w:val="1"/>
+      <w:numFmt w:val="bullet"/>
+      <w:lvlText w:val=""/>
+      <w:lvlJc w:val="left"/>
+      <w:pPr>
+        <w:tabs>
+          <w:tab w:val="num" w:pos="2880"/>
+        </w:tabs>
+        <w:ind w:left="2880" w:hanging="360"/>
+      </w:pPr>
+      <w:rPr>
+        <w:rFonts w:ascii="Wingdings" w:hAnsi="Wingdings" w:hint="default"/>
+        <w:sz w:val="20"/>
+      </w:rPr>
+    </w:lvl>
+    <w:lvl w:ilvl="4" w:tentative="1">
+      <w:start w:val="1"/>
+      <w:numFmt w:val="bullet"/>
+      <w:lvlText w:val=""/>
+      <w:lvlJc w:val="left"/>
+      <w:pPr>
+        <w:tabs>
+          <w:tab w:val="num" w:pos="3600"/>
+        </w:tabs>
+        <w:ind w:left="3600" w:hanging="360"/>
+      </w:pPr>
+      <w:rPr>
+        <w:rFonts w:ascii="Wingdings" w:hAnsi="Wingdings" w:hint="default"/>
+        <w:sz w:val="20"/>
+      </w:rPr>
+    </w:lvl>
+    <w:lvl w:ilvl="5" w:tentative="1">
+      <w:start w:val="1"/>
+      <w:numFmt w:val="bullet"/>
+      <w:lvlText w:val=""/>
+      <w:lvlJc w:val="left"/>
+      <w:pPr>
+        <w:tabs>
+          <w:tab w:val="num" w:pos="4320"/>
+        </w:tabs>
+        <w:ind w:left="4320" w:hanging="360"/>
+      </w:pPr>
+      <w:rPr>
+        <w:rFonts w:ascii="Wingdings" w:hAnsi="Wingdings" w:hint="default"/>
+        <w:sz w:val="20"/>
+      </w:rPr>
+    </w:lvl>
+    <w:lvl w:ilvl="6" w:tentative="1">
+      <w:start w:val="1"/>
+      <w:numFmt w:val="bullet"/>
+      <w:lvlText w:val=""/>
+      <w:lvlJc w:val="left"/>
+      <w:pPr>
+        <w:tabs>
+          <w:tab w:val="num" w:pos="5040"/>
+        </w:tabs>
+        <w:ind w:left="5040" w:hanging="360"/>
+      </w:pPr>
+      <w:rPr>
+        <w:rFonts w:ascii="Wingdings" w:hAnsi="Wingdings" w:hint="default"/>
+        <w:sz w:val="20"/>
+      </w:rPr>
+    </w:lvl>
+    <w:lvl w:ilvl="7" w:tentative="1">
+      <w:start w:val="1"/>
+      <w:numFmt w:val="bullet"/>
+      <w:lvlText w:val=""/>
+      <w:lvlJc w:val="left"/>
+      <w:pPr>
+        <w:tabs>
+          <w:tab w:val="num" w:pos="5760"/>
+        </w:tabs>
+        <w:ind w:left="5760" w:hanging="360"/>
+      </w:pPr>
+      <w:rPr>
+        <w:rFonts w:ascii="Wingdings" w:hAnsi="Wingdings" w:hint="default"/>
+        <w:sz w:val="20"/>
+      </w:rPr>
+    </w:lvl>
+    <w:lvl w:ilvl="8" w:tentative="1">
+      <w:start w:val="1"/>
+      <w:numFmt w:val="bullet"/>
+      <w:lvlText w:val=""/>
+      <w:lvlJc w:val="left"/>
+      <w:pPr>
+        <w:tabs>
+          <w:tab w:val="num" w:pos="6480"/>
+        </w:tabs>
+        <w:ind w:left="6480" w:hanging="360"/>
+      </w:pPr>
+      <w:rPr>
+        <w:rFonts w:ascii="Wingdings" w:hAnsi="Wingdings" w:hint="default"/>
+        <w:sz w:val="20"/>
+      </w:rPr>
+    </w:lvl>
+  </w:abstractNum>
+  <w:abstractNum w:abstractNumId="10" w15:restartNumberingAfterBreak="0">
     <w:nsid w:val="24561FC6"/>
     <w:multiLevelType w:val="multilevel"/>
     <w:tmpl w:val="A21E0B50"/>
@@ -7536,7 +8393,7 @@
       </w:pPr>
     </w:lvl>
   </w:abstractNum>
-  <w:abstractNum w:abstractNumId="9" w15:restartNumberingAfterBreak="0">
+  <w:abstractNum w:abstractNumId="11" w15:restartNumberingAfterBreak="0">
     <w:nsid w:val="26E4359D"/>
     <w:multiLevelType w:val="hybridMultilevel"/>
     <w:tmpl w:val="72268E06"/>
@@ -7625,7 +8482,7 @@
       </w:pPr>
     </w:lvl>
   </w:abstractNum>
-  <w:abstractNum w:abstractNumId="10" w15:restartNumberingAfterBreak="0">
+  <w:abstractNum w:abstractNumId="12" w15:restartNumberingAfterBreak="0">
     <w:nsid w:val="2B727FF4"/>
     <w:multiLevelType w:val="multilevel"/>
     <w:tmpl w:val="2090914E"/>
@@ -7738,7 +8595,7 @@
       </w:pPr>
     </w:lvl>
   </w:abstractNum>
-  <w:abstractNum w:abstractNumId="11" w15:restartNumberingAfterBreak="0">
+  <w:abstractNum w:abstractNumId="13" w15:restartNumberingAfterBreak="0">
     <w:nsid w:val="32036784"/>
     <w:multiLevelType w:val="multilevel"/>
     <w:tmpl w:val="AB2C578C"/>
@@ -7874,7 +8731,7 @@
       </w:rPr>
     </w:lvl>
   </w:abstractNum>
-  <w:abstractNum w:abstractNumId="12" w15:restartNumberingAfterBreak="0">
+  <w:abstractNum w:abstractNumId="14" w15:restartNumberingAfterBreak="0">
     <w:nsid w:val="32983F24"/>
     <w:multiLevelType w:val="hybridMultilevel"/>
     <w:tmpl w:val="EECA5FE0"/>
@@ -7987,7 +8844,7 @@
       </w:rPr>
     </w:lvl>
   </w:abstractNum>
-  <w:abstractNum w:abstractNumId="13" w15:restartNumberingAfterBreak="0">
+  <w:abstractNum w:abstractNumId="15" w15:restartNumberingAfterBreak="0">
     <w:nsid w:val="337E30E2"/>
     <w:multiLevelType w:val="hybridMultilevel"/>
     <w:tmpl w:val="46348550"/>
@@ -8076,7 +8933,7 @@
       </w:pPr>
     </w:lvl>
   </w:abstractNum>
-  <w:abstractNum w:abstractNumId="14" w15:restartNumberingAfterBreak="0">
+  <w:abstractNum w:abstractNumId="16" w15:restartNumberingAfterBreak="0">
     <w:nsid w:val="33CE1C48"/>
     <w:multiLevelType w:val="multilevel"/>
     <w:tmpl w:val="43AEB9F6"/>
@@ -8225,7 +9082,7 @@
       </w:rPr>
     </w:lvl>
   </w:abstractNum>
-  <w:abstractNum w:abstractNumId="15" w15:restartNumberingAfterBreak="0">
+  <w:abstractNum w:abstractNumId="17" w15:restartNumberingAfterBreak="0">
     <w:nsid w:val="39581280"/>
     <w:multiLevelType w:val="multilevel"/>
     <w:tmpl w:val="F53A5ED0"/>
@@ -8338,7 +9195,7 @@
       </w:pPr>
     </w:lvl>
   </w:abstractNum>
-  <w:abstractNum w:abstractNumId="16" w15:restartNumberingAfterBreak="0">
+  <w:abstractNum w:abstractNumId="18" w15:restartNumberingAfterBreak="0">
     <w:nsid w:val="3A7F5DE6"/>
     <w:multiLevelType w:val="hybridMultilevel"/>
     <w:tmpl w:val="A6C2CEE8"/>
@@ -8428,7 +9285,7 @@
       </w:pPr>
     </w:lvl>
   </w:abstractNum>
-  <w:abstractNum w:abstractNumId="17" w15:restartNumberingAfterBreak="0">
+  <w:abstractNum w:abstractNumId="19" w15:restartNumberingAfterBreak="0">
     <w:nsid w:val="3CEC7BF8"/>
     <w:multiLevelType w:val="hybridMultilevel"/>
     <w:tmpl w:val="A6C2CEE8"/>
@@ -8518,7 +9375,7 @@
       </w:pPr>
     </w:lvl>
   </w:abstractNum>
-  <w:abstractNum w:abstractNumId="18" w15:restartNumberingAfterBreak="0">
+  <w:abstractNum w:abstractNumId="20" w15:restartNumberingAfterBreak="0">
     <w:nsid w:val="456A325B"/>
     <w:multiLevelType w:val="multilevel"/>
     <w:tmpl w:val="3922452C"/>
@@ -8631,7 +9488,7 @@
       </w:pPr>
     </w:lvl>
   </w:abstractNum>
-  <w:abstractNum w:abstractNumId="19" w15:restartNumberingAfterBreak="0">
+  <w:abstractNum w:abstractNumId="21" w15:restartNumberingAfterBreak="0">
     <w:nsid w:val="46F3237D"/>
     <w:multiLevelType w:val="hybridMultilevel"/>
     <w:tmpl w:val="65F25B42"/>
@@ -8720,7 +9577,7 @@
       </w:pPr>
     </w:lvl>
   </w:abstractNum>
-  <w:abstractNum w:abstractNumId="20" w15:restartNumberingAfterBreak="0">
+  <w:abstractNum w:abstractNumId="22" w15:restartNumberingAfterBreak="0">
     <w:nsid w:val="48544781"/>
     <w:multiLevelType w:val="multilevel"/>
     <w:tmpl w:val="CAFC9EFA"/>
@@ -8806,7 +9663,7 @@
       </w:pPr>
     </w:lvl>
   </w:abstractNum>
-  <w:abstractNum w:abstractNumId="21" w15:restartNumberingAfterBreak="0">
+  <w:abstractNum w:abstractNumId="23" w15:restartNumberingAfterBreak="0">
     <w:nsid w:val="4896633F"/>
     <w:multiLevelType w:val="multilevel"/>
     <w:tmpl w:val="4D4E31D8"/>
@@ -8919,7 +9776,7 @@
       </w:pPr>
     </w:lvl>
   </w:abstractNum>
-  <w:abstractNum w:abstractNumId="22" w15:restartNumberingAfterBreak="0">
+  <w:abstractNum w:abstractNumId="24" w15:restartNumberingAfterBreak="0">
     <w:nsid w:val="4B84592F"/>
     <w:multiLevelType w:val="multilevel"/>
     <w:tmpl w:val="84228642"/>
@@ -9029,7 +9886,7 @@
       </w:pPr>
     </w:lvl>
   </w:abstractNum>
-  <w:abstractNum w:abstractNumId="23" w15:restartNumberingAfterBreak="0">
+  <w:abstractNum w:abstractNumId="25" w15:restartNumberingAfterBreak="0">
     <w:nsid w:val="4BB2268E"/>
     <w:multiLevelType w:val="multilevel"/>
     <w:tmpl w:val="657A7FEE"/>
@@ -9165,7 +10022,7 @@
       </w:rPr>
     </w:lvl>
   </w:abstractNum>
-  <w:abstractNum w:abstractNumId="24" w15:restartNumberingAfterBreak="0">
+  <w:abstractNum w:abstractNumId="26" w15:restartNumberingAfterBreak="0">
     <w:nsid w:val="4BEB4D5D"/>
     <w:multiLevelType w:val="hybridMultilevel"/>
     <w:tmpl w:val="6D1C526C"/>
@@ -9278,7 +10135,7 @@
       </w:rPr>
     </w:lvl>
   </w:abstractNum>
-  <w:abstractNum w:abstractNumId="25" w15:restartNumberingAfterBreak="0">
+  <w:abstractNum w:abstractNumId="27" w15:restartNumberingAfterBreak="0">
     <w:nsid w:val="4E8F0E47"/>
     <w:multiLevelType w:val="hybridMultilevel"/>
     <w:tmpl w:val="C45A2D1E"/>
@@ -9364,7 +10221,7 @@
       </w:pPr>
     </w:lvl>
   </w:abstractNum>
-  <w:abstractNum w:abstractNumId="26" w15:restartNumberingAfterBreak="0">
+  <w:abstractNum w:abstractNumId="28" w15:restartNumberingAfterBreak="0">
     <w:nsid w:val="524D0EFA"/>
     <w:multiLevelType w:val="hybridMultilevel"/>
     <w:tmpl w:val="A2AAD518"/>
@@ -9454,7 +10311,7 @@
       </w:pPr>
     </w:lvl>
   </w:abstractNum>
-  <w:abstractNum w:abstractNumId="27" w15:restartNumberingAfterBreak="0">
+  <w:abstractNum w:abstractNumId="29" w15:restartNumberingAfterBreak="0">
     <w:nsid w:val="54500C76"/>
     <w:multiLevelType w:val="hybridMultilevel"/>
     <w:tmpl w:val="C2D4F764"/>
@@ -9567,7 +10424,7 @@
       </w:rPr>
     </w:lvl>
   </w:abstractNum>
-  <w:abstractNum w:abstractNumId="28" w15:restartNumberingAfterBreak="0">
+  <w:abstractNum w:abstractNumId="30" w15:restartNumberingAfterBreak="0">
     <w:nsid w:val="55A56925"/>
     <w:multiLevelType w:val="hybridMultilevel"/>
     <w:tmpl w:val="20DE528E"/>
@@ -9656,7 +10513,7 @@
       </w:pPr>
     </w:lvl>
   </w:abstractNum>
-  <w:abstractNum w:abstractNumId="29" w15:restartNumberingAfterBreak="0">
+  <w:abstractNum w:abstractNumId="31" w15:restartNumberingAfterBreak="0">
     <w:nsid w:val="55DA57E3"/>
     <w:multiLevelType w:val="hybridMultilevel"/>
     <w:tmpl w:val="EB1AECB2"/>
@@ -9769,7 +10626,7 @@
       </w:rPr>
     </w:lvl>
   </w:abstractNum>
-  <w:abstractNum w:abstractNumId="30" w15:restartNumberingAfterBreak="0">
+  <w:abstractNum w:abstractNumId="32" w15:restartNumberingAfterBreak="0">
     <w:nsid w:val="563A3FF4"/>
     <w:multiLevelType w:val="hybridMultilevel"/>
     <w:tmpl w:val="4B2C5176"/>
@@ -9858,7 +10715,7 @@
       </w:pPr>
     </w:lvl>
   </w:abstractNum>
-  <w:abstractNum w:abstractNumId="31" w15:restartNumberingAfterBreak="0">
+  <w:abstractNum w:abstractNumId="33" w15:restartNumberingAfterBreak="0">
     <w:nsid w:val="5EC7337B"/>
     <w:multiLevelType w:val="hybridMultilevel"/>
     <w:tmpl w:val="EFAAD294"/>
@@ -9944,7 +10801,7 @@
       </w:pPr>
     </w:lvl>
   </w:abstractNum>
-  <w:abstractNum w:abstractNumId="32" w15:restartNumberingAfterBreak="0">
+  <w:abstractNum w:abstractNumId="34" w15:restartNumberingAfterBreak="0">
     <w:nsid w:val="67BB3DC3"/>
     <w:multiLevelType w:val="hybridMultilevel"/>
     <w:tmpl w:val="2F80C7D8"/>
@@ -10034,7 +10891,7 @@
       </w:pPr>
     </w:lvl>
   </w:abstractNum>
-  <w:abstractNum w:abstractNumId="33" w15:restartNumberingAfterBreak="0">
+  <w:abstractNum w:abstractNumId="35" w15:restartNumberingAfterBreak="0">
     <w:nsid w:val="71AB0AAC"/>
     <w:multiLevelType w:val="hybridMultilevel"/>
     <w:tmpl w:val="4AFE64C2"/>
@@ -10124,7 +10981,7 @@
       </w:pPr>
     </w:lvl>
   </w:abstractNum>
-  <w:abstractNum w:abstractNumId="34" w15:restartNumberingAfterBreak="0">
+  <w:abstractNum w:abstractNumId="36" w15:restartNumberingAfterBreak="0">
     <w:nsid w:val="731F3575"/>
     <w:multiLevelType w:val="hybridMultilevel"/>
     <w:tmpl w:val="310859DC"/>
@@ -10237,7 +11094,7 @@
       </w:rPr>
     </w:lvl>
   </w:abstractNum>
-  <w:abstractNum w:abstractNumId="35" w15:restartNumberingAfterBreak="0">
+  <w:abstractNum w:abstractNumId="37" w15:restartNumberingAfterBreak="0">
     <w:nsid w:val="740A6FE2"/>
     <w:multiLevelType w:val="multilevel"/>
     <w:tmpl w:val="F1D06696"/>
@@ -10354,7 +11211,7 @@
       </w:pPr>
     </w:lvl>
   </w:abstractNum>
-  <w:abstractNum w:abstractNumId="36" w15:restartNumberingAfterBreak="0">
+  <w:abstractNum w:abstractNumId="38" w15:restartNumberingAfterBreak="0">
     <w:nsid w:val="75286323"/>
     <w:multiLevelType w:val="hybridMultilevel"/>
     <w:tmpl w:val="1BB09CE6"/>
@@ -10467,7 +11324,120 @@
       </w:rPr>
     </w:lvl>
   </w:abstractNum>
-  <w:abstractNum w:abstractNumId="37" w15:restartNumberingAfterBreak="0">
+  <w:abstractNum w:abstractNumId="39" w15:restartNumberingAfterBreak="0">
+    <w:nsid w:val="75632E17"/>
+    <w:multiLevelType w:val="multilevel"/>
+    <w:tmpl w:val="C09A8ED8"/>
+    <w:lvl w:ilvl="0">
+      <w:start w:val="1"/>
+      <w:numFmt w:val="decimal"/>
+      <w:lvlText w:val="%1."/>
+      <w:lvlJc w:val="left"/>
+      <w:pPr>
+        <w:tabs>
+          <w:tab w:val="num" w:pos="720"/>
+        </w:tabs>
+        <w:ind w:left="720" w:hanging="360"/>
+      </w:pPr>
+    </w:lvl>
+    <w:lvl w:ilvl="1" w:tentative="1">
+      <w:start w:val="1"/>
+      <w:numFmt w:val="decimal"/>
+      <w:lvlText w:val="%2."/>
+      <w:lvlJc w:val="left"/>
+      <w:pPr>
+        <w:tabs>
+          <w:tab w:val="num" w:pos="1440"/>
+        </w:tabs>
+        <w:ind w:left="1440" w:hanging="360"/>
+      </w:pPr>
+    </w:lvl>
+    <w:lvl w:ilvl="2" w:tentative="1">
+      <w:start w:val="1"/>
+      <w:numFmt w:val="decimal"/>
+      <w:lvlText w:val="%3."/>
+      <w:lvlJc w:val="left"/>
+      <w:pPr>
+        <w:tabs>
+          <w:tab w:val="num" w:pos="2160"/>
+        </w:tabs>
+        <w:ind w:left="2160" w:hanging="360"/>
+      </w:pPr>
+    </w:lvl>
+    <w:lvl w:ilvl="3" w:tentative="1">
+      <w:start w:val="1"/>
+      <w:numFmt w:val="decimal"/>
+      <w:lvlText w:val="%4."/>
+      <w:lvlJc w:val="left"/>
+      <w:pPr>
+        <w:tabs>
+          <w:tab w:val="num" w:pos="2880"/>
+        </w:tabs>
+        <w:ind w:left="2880" w:hanging="360"/>
+      </w:pPr>
+    </w:lvl>
+    <w:lvl w:ilvl="4" w:tentative="1">
+      <w:start w:val="1"/>
+      <w:numFmt w:val="decimal"/>
+      <w:lvlText w:val="%5."/>
+      <w:lvlJc w:val="left"/>
+      <w:pPr>
+        <w:tabs>
+          <w:tab w:val="num" w:pos="3600"/>
+        </w:tabs>
+        <w:ind w:left="3600" w:hanging="360"/>
+      </w:pPr>
+    </w:lvl>
+    <w:lvl w:ilvl="5" w:tentative="1">
+      <w:start w:val="1"/>
+      <w:numFmt w:val="decimal"/>
+      <w:lvlText w:val="%6."/>
+      <w:lvlJc w:val="left"/>
+      <w:pPr>
+        <w:tabs>
+          <w:tab w:val="num" w:pos="4320"/>
+        </w:tabs>
+        <w:ind w:left="4320" w:hanging="360"/>
+      </w:pPr>
+    </w:lvl>
+    <w:lvl w:ilvl="6" w:tentative="1">
+      <w:start w:val="1"/>
+      <w:numFmt w:val="decimal"/>
+      <w:lvlText w:val="%7."/>
+      <w:lvlJc w:val="left"/>
+      <w:pPr>
+        <w:tabs>
+          <w:tab w:val="num" w:pos="5040"/>
+        </w:tabs>
+        <w:ind w:left="5040" w:hanging="360"/>
+      </w:pPr>
+    </w:lvl>
+    <w:lvl w:ilvl="7" w:tentative="1">
+      <w:start w:val="1"/>
+      <w:numFmt w:val="decimal"/>
+      <w:lvlText w:val="%8."/>
+      <w:lvlJc w:val="left"/>
+      <w:pPr>
+        <w:tabs>
+          <w:tab w:val="num" w:pos="5760"/>
+        </w:tabs>
+        <w:ind w:left="5760" w:hanging="360"/>
+      </w:pPr>
+    </w:lvl>
+    <w:lvl w:ilvl="8" w:tentative="1">
+      <w:start w:val="1"/>
+      <w:numFmt w:val="decimal"/>
+      <w:lvlText w:val="%9."/>
+      <w:lvlJc w:val="left"/>
+      <w:pPr>
+        <w:tabs>
+          <w:tab w:val="num" w:pos="6480"/>
+        </w:tabs>
+        <w:ind w:left="6480" w:hanging="360"/>
+      </w:pPr>
+    </w:lvl>
+  </w:abstractNum>
+  <w:abstractNum w:abstractNumId="40" w15:restartNumberingAfterBreak="0">
     <w:nsid w:val="765A24B6"/>
     <w:multiLevelType w:val="multilevel"/>
     <w:tmpl w:val="443E60A2"/>
@@ -10616,7 +11586,7 @@
       </w:rPr>
     </w:lvl>
   </w:abstractNum>
-  <w:abstractNum w:abstractNumId="38" w15:restartNumberingAfterBreak="0">
+  <w:abstractNum w:abstractNumId="41" w15:restartNumberingAfterBreak="0">
     <w:nsid w:val="76B71523"/>
     <w:multiLevelType w:val="hybridMultilevel"/>
     <w:tmpl w:val="33A6C498"/>
@@ -10729,7 +11699,7 @@
       </w:rPr>
     </w:lvl>
   </w:abstractNum>
-  <w:abstractNum w:abstractNumId="39" w15:restartNumberingAfterBreak="0">
+  <w:abstractNum w:abstractNumId="42" w15:restartNumberingAfterBreak="0">
     <w:nsid w:val="7AF677F9"/>
     <w:multiLevelType w:val="hybridMultilevel"/>
     <w:tmpl w:val="019C17FE"/>
@@ -10843,124 +11813,133 @@
     </w:lvl>
   </w:abstractNum>
   <w:num w:numId="1" w16cid:durableId="1281761414">
-    <w:abstractNumId w:val="9"/>
+    <w:abstractNumId w:val="11"/>
   </w:num>
   <w:num w:numId="2" w16cid:durableId="1188300148">
-    <w:abstractNumId w:val="25"/>
+    <w:abstractNumId w:val="27"/>
   </w:num>
   <w:num w:numId="3" w16cid:durableId="2054309772">
-    <w:abstractNumId w:val="17"/>
+    <w:abstractNumId w:val="19"/>
   </w:num>
   <w:num w:numId="4" w16cid:durableId="1544437120">
-    <w:abstractNumId w:val="31"/>
+    <w:abstractNumId w:val="33"/>
   </w:num>
   <w:num w:numId="5" w16cid:durableId="1564835162">
-    <w:abstractNumId w:val="30"/>
+    <w:abstractNumId w:val="32"/>
   </w:num>
   <w:num w:numId="6" w16cid:durableId="2042627530">
     <w:abstractNumId w:val="0"/>
   </w:num>
   <w:num w:numId="7" w16cid:durableId="1758096276">
-    <w:abstractNumId w:val="19"/>
+    <w:abstractNumId w:val="21"/>
   </w:num>
   <w:num w:numId="8" w16cid:durableId="2043362100">
+    <w:abstractNumId w:val="30"/>
+  </w:num>
+  <w:num w:numId="9" w16cid:durableId="1817718604">
+    <w:abstractNumId w:val="35"/>
+  </w:num>
+  <w:num w:numId="10" w16cid:durableId="35542396">
     <w:abstractNumId w:val="28"/>
   </w:num>
-  <w:num w:numId="9" w16cid:durableId="1817718604">
-    <w:abstractNumId w:val="33"/>
+  <w:num w:numId="11" w16cid:durableId="1802073865">
+    <w:abstractNumId w:val="18"/>
   </w:num>
-  <w:num w:numId="10" w16cid:durableId="35542396">
-    <w:abstractNumId w:val="26"/>
+  <w:num w:numId="12" w16cid:durableId="399332692">
+    <w:abstractNumId w:val="34"/>
   </w:num>
-  <w:num w:numId="11" w16cid:durableId="1802073865">
+  <w:num w:numId="13" w16cid:durableId="940840359">
+    <w:abstractNumId w:val="3"/>
+  </w:num>
+  <w:num w:numId="14" w16cid:durableId="1052922378">
+    <w:abstractNumId w:val="29"/>
+  </w:num>
+  <w:num w:numId="15" w16cid:durableId="1774394743">
+    <w:abstractNumId w:val="22"/>
+  </w:num>
+  <w:num w:numId="16" w16cid:durableId="287274435">
+    <w:abstractNumId w:val="5"/>
+  </w:num>
+  <w:num w:numId="17" w16cid:durableId="178664772">
+    <w:abstractNumId w:val="4"/>
+  </w:num>
+  <w:num w:numId="18" w16cid:durableId="1802921072">
+    <w:abstractNumId w:val="24"/>
+  </w:num>
+  <w:num w:numId="19" w16cid:durableId="101726067">
+    <w:abstractNumId w:val="20"/>
+  </w:num>
+  <w:num w:numId="20" w16cid:durableId="2099515969">
+    <w:abstractNumId w:val="6"/>
+  </w:num>
+  <w:num w:numId="21" w16cid:durableId="1645887944">
+    <w:abstractNumId w:val="40"/>
+  </w:num>
+  <w:num w:numId="22" w16cid:durableId="190849718">
+    <w:abstractNumId w:val="37"/>
+  </w:num>
+  <w:num w:numId="23" w16cid:durableId="1465541652">
+    <w:abstractNumId w:val="23"/>
+  </w:num>
+  <w:num w:numId="24" w16cid:durableId="1855916906">
+    <w:abstractNumId w:val="12"/>
+  </w:num>
+  <w:num w:numId="25" w16cid:durableId="324817346">
+    <w:abstractNumId w:val="17"/>
+  </w:num>
+  <w:num w:numId="26" w16cid:durableId="815729462">
+    <w:abstractNumId w:val="15"/>
+  </w:num>
+  <w:num w:numId="27" w16cid:durableId="963973080">
+    <w:abstractNumId w:val="36"/>
+  </w:num>
+  <w:num w:numId="28" w16cid:durableId="1089086920">
     <w:abstractNumId w:val="16"/>
   </w:num>
-  <w:num w:numId="12" w16cid:durableId="399332692">
-    <w:abstractNumId w:val="32"/>
+  <w:num w:numId="29" w16cid:durableId="693770078">
+    <w:abstractNumId w:val="7"/>
   </w:num>
-  <w:num w:numId="13" w16cid:durableId="940840359">
-    <w:abstractNumId w:val="2"/>
+  <w:num w:numId="30" w16cid:durableId="1960258988">
+    <w:abstractNumId w:val="31"/>
   </w:num>
-  <w:num w:numId="14" w16cid:durableId="1052922378">
-    <w:abstractNumId w:val="27"/>
+  <w:num w:numId="31" w16cid:durableId="1327246087">
+    <w:abstractNumId w:val="41"/>
   </w:num>
-  <w:num w:numId="15" w16cid:durableId="1774394743">
-    <w:abstractNumId w:val="20"/>
-  </w:num>
-  <w:num w:numId="16" w16cid:durableId="287274435">
-    <w:abstractNumId w:val="4"/>
-  </w:num>
-  <w:num w:numId="17" w16cid:durableId="178664772">
-    <w:abstractNumId w:val="3"/>
-  </w:num>
-  <w:num w:numId="18" w16cid:durableId="1802921072">
-    <w:abstractNumId w:val="22"/>
-  </w:num>
-  <w:num w:numId="19" w16cid:durableId="101726067">
-    <w:abstractNumId w:val="18"/>
-  </w:num>
-  <w:num w:numId="20" w16cid:durableId="2099515969">
-    <w:abstractNumId w:val="5"/>
-  </w:num>
-  <w:num w:numId="21" w16cid:durableId="1645887944">
-    <w:abstractNumId w:val="37"/>
-  </w:num>
-  <w:num w:numId="22" w16cid:durableId="190849718">
-    <w:abstractNumId w:val="35"/>
-  </w:num>
-  <w:num w:numId="23" w16cid:durableId="1465541652">
-    <w:abstractNumId w:val="21"/>
-  </w:num>
-  <w:num w:numId="24" w16cid:durableId="1855916906">
-    <w:abstractNumId w:val="10"/>
-  </w:num>
-  <w:num w:numId="25" w16cid:durableId="324817346">
-    <w:abstractNumId w:val="15"/>
-  </w:num>
-  <w:num w:numId="26" w16cid:durableId="815729462">
-    <w:abstractNumId w:val="13"/>
-  </w:num>
-  <w:num w:numId="27" w16cid:durableId="963973080">
-    <w:abstractNumId w:val="34"/>
-  </w:num>
-  <w:num w:numId="28" w16cid:durableId="1089086920">
+  <w:num w:numId="32" w16cid:durableId="1617061729">
     <w:abstractNumId w:val="14"/>
   </w:num>
-  <w:num w:numId="29" w16cid:durableId="693770078">
-    <w:abstractNumId w:val="6"/>
-  </w:num>
-  <w:num w:numId="30" w16cid:durableId="1960258988">
-    <w:abstractNumId w:val="29"/>
-  </w:num>
-  <w:num w:numId="31" w16cid:durableId="1327246087">
+  <w:num w:numId="33" w16cid:durableId="1867481002">
     <w:abstractNumId w:val="38"/>
-  </w:num>
-  <w:num w:numId="32" w16cid:durableId="1617061729">
-    <w:abstractNumId w:val="12"/>
-  </w:num>
-  <w:num w:numId="33" w16cid:durableId="1867481002">
-    <w:abstractNumId w:val="36"/>
   </w:num>
   <w:num w:numId="34" w16cid:durableId="1755348510">
     <w:abstractNumId w:val="1"/>
   </w:num>
   <w:num w:numId="35" w16cid:durableId="531654473">
-    <w:abstractNumId w:val="7"/>
+    <w:abstractNumId w:val="8"/>
   </w:num>
   <w:num w:numId="36" w16cid:durableId="1915163100">
-    <w:abstractNumId w:val="24"/>
+    <w:abstractNumId w:val="26"/>
   </w:num>
   <w:num w:numId="37" w16cid:durableId="1812937104">
-    <w:abstractNumId w:val="39"/>
+    <w:abstractNumId w:val="42"/>
   </w:num>
   <w:num w:numId="38" w16cid:durableId="624583321">
-    <w:abstractNumId w:val="8"/>
+    <w:abstractNumId w:val="10"/>
   </w:num>
   <w:num w:numId="39" w16cid:durableId="691953691">
-    <w:abstractNumId w:val="11"/>
+    <w:abstractNumId w:val="13"/>
   </w:num>
   <w:num w:numId="40" w16cid:durableId="523056553">
-    <w:abstractNumId w:val="23"/>
+    <w:abstractNumId w:val="25"/>
+  </w:num>
+  <w:num w:numId="41" w16cid:durableId="1311979514">
+    <w:abstractNumId w:val="2"/>
+  </w:num>
+  <w:num w:numId="42" w16cid:durableId="150870483">
+    <w:abstractNumId w:val="9"/>
+  </w:num>
+  <w:num w:numId="43" w16cid:durableId="1282571739">
+    <w:abstractNumId w:val="39"/>
   </w:num>
 </w:numbering>
 </file>

</xml_diff>